<commit_message>
refine data requirements and add unfinished ERD
</commit_message>
<xml_diff>
--- a/Data related/Data Requirements description.docx
+++ b/Data related/Data Requirements description.docx
@@ -326,6 +326,13 @@
         </w:rPr>
         <w:t> (rent, size, location, available from/to, deposit, extra fees, auto-generated ad ID) and </w:t>
       </w:r>
+      <w:r>
+        <w:rPr>
+          <w:sz w:val="22"/>
+          <w:szCs w:val="22"/>
+        </w:rPr>
+        <w:t>the link to the original ad</w:t>
+      </w:r>
     </w:p>
     <w:p>
       <w:pPr>
@@ -348,7 +355,7 @@
           <w:sz w:val="22"/>
           <w:szCs w:val="22"/>
         </w:rPr>
-        <w:t xml:space="preserve"> (dorm name, address, number of rooms, rent prices, room types, general </w:t>
+        <w:t xml:space="preserve"> (dorm name, address, number of rooms, rent price, room type, general </w:t>
       </w:r>
       <w:proofErr w:type="spellStart"/>
       <w:r>
@@ -424,7 +431,7 @@
           <w:sz w:val="22"/>
           <w:szCs w:val="22"/>
         </w:rPr>
-        <w:t xml:space="preserve">, each office has a name, official address, general phone and email, website URL, opening hours, services offered, required documents, processing time estimates, appointment link, and one exterior picture, with no user relationship other than being viewed. </w:t>
+        <w:t xml:space="preserve">, each office has a name, official address, general phone and email, website URL, opening hours, required documents, processing time estimates, appointment link, and one exterior picture, with no user relationship other than being viewed. </w:t>
       </w:r>
     </w:p>
     <w:p>

</xml_diff>

<commit_message>
add the user password in the data requirement
</commit_message>
<xml_diff>
--- a/Data related/Data Requirements description.docx
+++ b/Data related/Data Requirements description.docx
@@ -97,6 +97,13 @@
         </w:rPr>
         <w:t xml:space="preserve"> </w:t>
       </w:r>
+      <w:r>
+        <w:rPr>
+          <w:sz w:val="22"/>
+          <w:szCs w:val="22"/>
+        </w:rPr>
+        <w:t xml:space="preserve"> update a password that has at least one capital letter, 3 digits and a special character of length at least 8.</w:t>
+      </w:r>
     </w:p>
     <w:p>
       <w:pPr>
@@ -434,6 +441,7 @@
           <w:sz w:val="22"/>
           <w:szCs w:val="22"/>
         </w:rPr>
+        <w:lastRenderedPageBreak/>
         <w:t>All content (jobs, sports, accommodation, immigration offices, museums) exists independently, and users interact with them only through searching, viewing, and clicking external links to complete applications, contact landlords, book appointments, or purchase tickets.</w:t>
       </w:r>
     </w:p>

</xml_diff>